<commit_message>
edit cards for book and BabyCar
</commit_message>
<xml_diff>
--- a/Abstract&interface&polymorphism.docx
+++ b/Abstract&interface&polymorphism.docx
@@ -58,6 +58,15 @@
     </w:p>
     <w:p>
       <w:pPr>
+        <w:pStyle w:val="BodyText"/>
+        <w:bidi/>
+        <w:rPr>
+          <w:lang w:val="en-US"/>
+        </w:rPr>
+      </w:pPr>
+    </w:p>
+    <w:p>
+      <w:pPr>
         <w:pStyle w:val="Bibliography"/>
         <w:bidi/>
         <w:rPr>
@@ -78,7 +87,23 @@
           <w:sz w:val="28"/>
           <w:szCs w:val="28"/>
         </w:rPr>
-        <w:t xml:space="preserve"> Abstract Class </w:t>
+        <w:t xml:space="preserve"> </w:t>
+      </w:r>
+      <w:r>
+        <w:rPr>
+          <w:b/>
+          <w:bCs/>
+          <w:sz w:val="28"/>
+          <w:szCs w:val="28"/>
+        </w:rPr>
+        <w:t>Abstract Class</w:t>
+      </w:r>
+      <w:r>
+        <w:rPr>
+          <w:sz w:val="28"/>
+          <w:szCs w:val="28"/>
+        </w:rPr>
+        <w:t xml:space="preserve"> </w:t>
       </w:r>
       <w:r>
         <w:rPr>
@@ -93,7 +118,23 @@
           <w:sz w:val="28"/>
           <w:szCs w:val="28"/>
         </w:rPr>
-        <w:t xml:space="preserve"> (object) </w:t>
+        <w:t xml:space="preserve"> (</w:t>
+      </w:r>
+      <w:r>
+        <w:rPr>
+          <w:b/>
+          <w:bCs/>
+          <w:sz w:val="28"/>
+          <w:szCs w:val="28"/>
+        </w:rPr>
+        <w:t>object</w:t>
+      </w:r>
+      <w:r>
+        <w:rPr>
+          <w:sz w:val="28"/>
+          <w:szCs w:val="28"/>
+        </w:rPr>
+        <w:t xml:space="preserve">) </w:t>
       </w:r>
       <w:r>
         <w:rPr>
@@ -108,7 +149,23 @@
           <w:sz w:val="28"/>
           <w:szCs w:val="28"/>
         </w:rPr>
-        <w:t xml:space="preserve">” (base) </w:t>
+        <w:t>” (</w:t>
+      </w:r>
+      <w:r>
+        <w:rPr>
+          <w:b/>
+          <w:bCs/>
+          <w:sz w:val="28"/>
+          <w:szCs w:val="28"/>
+        </w:rPr>
+        <w:t>base</w:t>
+      </w:r>
+      <w:r>
+        <w:rPr>
+          <w:sz w:val="28"/>
+          <w:szCs w:val="28"/>
+        </w:rPr>
+        <w:t xml:space="preserve">) </w:t>
       </w:r>
       <w:r>
         <w:rPr>
@@ -117,15 +174,34 @@
           <w:szCs w:val="28"/>
           <w:rtl/>
         </w:rPr>
-        <w:t xml:space="preserve">  ل</w:t>
-      </w:r>
-      <w:r>
-        <w:rPr>
-          <w:sz w:val="28"/>
-          <w:szCs w:val="28"/>
-          <w:rtl/>
-        </w:rPr>
-        <w:t>كلاسات أخرى ترث منه</w:t>
+        <w:t xml:space="preserve">  </w:t>
+      </w:r>
+      <w:proofErr w:type="spellStart"/>
+      <w:r>
+        <w:rPr>
+          <w:rFonts w:hint="cs"/>
+          <w:sz w:val="28"/>
+          <w:szCs w:val="28"/>
+          <w:rtl/>
+        </w:rPr>
+        <w:t>ل</w:t>
+      </w:r>
+      <w:r>
+        <w:rPr>
+          <w:sz w:val="28"/>
+          <w:szCs w:val="28"/>
+          <w:rtl/>
+        </w:rPr>
+        <w:t>كلاسات</w:t>
+      </w:r>
+      <w:proofErr w:type="spellEnd"/>
+      <w:r>
+        <w:rPr>
+          <w:sz w:val="28"/>
+          <w:szCs w:val="28"/>
+          <w:rtl/>
+        </w:rPr>
+        <w:t xml:space="preserve"> أخرى ترث منه</w:t>
       </w:r>
       <w:r>
         <w:rPr>
@@ -134,6 +210,16 @@
         </w:rPr>
         <w:t>.</w:t>
       </w:r>
+    </w:p>
+    <w:p>
+      <w:pPr>
+        <w:pStyle w:val="Bibliography"/>
+        <w:bidi/>
+        <w:rPr>
+          <w:sz w:val="28"/>
+          <w:szCs w:val="28"/>
+        </w:rPr>
+      </w:pPr>
     </w:p>
     <w:p>
       <w:pPr>
@@ -172,11 +258,15 @@
         </w:numPr>
         <w:bidi/>
         <w:rPr>
-          <w:lang w:val="en-US"/>
-        </w:rPr>
-      </w:pPr>
-      <w:r>
-        <w:rPr>
+          <w:sz w:val="28"/>
+          <w:szCs w:val="28"/>
+          <w:lang w:val="en-US"/>
+        </w:rPr>
+      </w:pPr>
+      <w:r>
+        <w:rPr>
+          <w:sz w:val="28"/>
+          <w:szCs w:val="28"/>
           <w:rtl/>
           <w:lang w:val="en-US"/>
         </w:rPr>
@@ -184,6 +274,8 @@
       </w:r>
       <w:r>
         <w:rPr>
+          <w:sz w:val="28"/>
+          <w:szCs w:val="28"/>
           <w:lang w:val="en-US"/>
         </w:rPr>
         <w:t xml:space="preserve">: </w:t>
@@ -198,11 +290,15 @@
         </w:numPr>
         <w:bidi/>
         <w:rPr>
-          <w:lang w:val="en-US"/>
-        </w:rPr>
-      </w:pPr>
-      <w:r>
-        <w:rPr>
+          <w:sz w:val="28"/>
+          <w:szCs w:val="28"/>
+          <w:lang w:val="en-US"/>
+        </w:rPr>
+      </w:pPr>
+      <w:r>
+        <w:rPr>
+          <w:sz w:val="28"/>
+          <w:szCs w:val="28"/>
           <w:rtl/>
           <w:lang w:val="en-US"/>
         </w:rPr>
@@ -210,13 +306,35 @@
       </w:r>
       <w:r>
         <w:rPr>
-          <w:lang w:val="en-US"/>
-        </w:rPr>
-        <w:t xml:space="preserve"> abstract </w:t>
+          <w:sz w:val="28"/>
+          <w:szCs w:val="28"/>
+          <w:lang w:val="en-US"/>
+        </w:rPr>
+        <w:t xml:space="preserve"> </w:t>
+      </w:r>
+      <w:r>
+        <w:rPr>
+          <w:b/>
+          <w:bCs/>
+          <w:sz w:val="28"/>
+          <w:szCs w:val="28"/>
+          <w:lang w:val="en-US"/>
+        </w:rPr>
+        <w:t>abstract</w:t>
+      </w:r>
+      <w:r>
+        <w:rPr>
+          <w:sz w:val="28"/>
+          <w:szCs w:val="28"/>
+          <w:lang w:val="en-US"/>
+        </w:rPr>
+        <w:t xml:space="preserve"> </w:t>
       </w:r>
       <w:r>
         <w:rPr>
           <w:rFonts w:hint="cs"/>
+          <w:sz w:val="28"/>
+          <w:szCs w:val="28"/>
           <w:rtl/>
           <w:lang w:val="en-US"/>
         </w:rPr>
@@ -224,6 +342,10 @@
       </w:r>
       <w:r>
         <w:rPr>
+          <w:b/>
+          <w:bCs/>
+          <w:sz w:val="28"/>
+          <w:szCs w:val="28"/>
           <w:rtl/>
           <w:lang w:val="en-US"/>
         </w:rPr>
@@ -231,6 +353,10 @@
       </w:r>
       <w:r>
         <w:rPr>
+          <w:b/>
+          <w:bCs/>
+          <w:sz w:val="28"/>
+          <w:szCs w:val="28"/>
           <w:lang w:val="en-US"/>
         </w:rPr>
         <w:t>implementation</w:t>
@@ -238,6 +364,8 @@
       <w:r>
         <w:rPr>
           <w:rFonts w:hint="cs"/>
+          <w:sz w:val="28"/>
+          <w:szCs w:val="28"/>
           <w:rtl/>
           <w:lang w:val="en-US"/>
         </w:rPr>
@@ -245,6 +373,8 @@
       </w:r>
       <w:r>
         <w:rPr>
+          <w:sz w:val="28"/>
+          <w:szCs w:val="28"/>
           <w:lang w:val="en-US"/>
         </w:rPr>
         <w:t xml:space="preserve"> </w:t>
@@ -259,11 +389,15 @@
         </w:numPr>
         <w:bidi/>
         <w:rPr>
-          <w:lang w:val="en-US"/>
-        </w:rPr>
-      </w:pPr>
-      <w:r>
-        <w:rPr>
+          <w:sz w:val="28"/>
+          <w:szCs w:val="28"/>
+          <w:lang w:val="en-US"/>
+        </w:rPr>
+      </w:pPr>
+      <w:r>
+        <w:rPr>
+          <w:sz w:val="28"/>
+          <w:szCs w:val="28"/>
           <w:rtl/>
           <w:lang w:val="en-US"/>
         </w:rPr>
@@ -271,12 +405,16 @@
       </w:r>
       <w:r>
         <w:rPr>
+          <w:sz w:val="28"/>
+          <w:szCs w:val="28"/>
           <w:lang w:val="en-US"/>
         </w:rPr>
         <w:t xml:space="preserve"> </w:t>
       </w:r>
       <w:r>
         <w:rPr>
+          <w:sz w:val="28"/>
+          <w:szCs w:val="28"/>
           <w:rtl/>
           <w:lang w:val="en-US"/>
         </w:rPr>
@@ -284,13 +422,35 @@
       </w:r>
       <w:r>
         <w:rPr>
-          <w:lang w:val="en-US"/>
-        </w:rPr>
-        <w:t xml:space="preserve"> implementation) </w:t>
+          <w:sz w:val="28"/>
+          <w:szCs w:val="28"/>
+          <w:lang w:val="en-US"/>
+        </w:rPr>
+        <w:t xml:space="preserve"> </w:t>
+      </w:r>
+      <w:r>
+        <w:rPr>
+          <w:b/>
+          <w:bCs/>
+          <w:sz w:val="28"/>
+          <w:szCs w:val="28"/>
+          <w:lang w:val="en-US"/>
+        </w:rPr>
+        <w:t>implementation</w:t>
+      </w:r>
+      <w:r>
+        <w:rPr>
+          <w:sz w:val="28"/>
+          <w:szCs w:val="28"/>
+          <w:lang w:val="en-US"/>
+        </w:rPr>
+        <w:t xml:space="preserve">) </w:t>
       </w:r>
       <w:r>
         <w:rPr>
           <w:rFonts w:hint="cs"/>
+          <w:sz w:val="28"/>
+          <w:szCs w:val="28"/>
           <w:rtl/>
           <w:lang w:val="en-US"/>
         </w:rPr>
@@ -306,11 +466,15 @@
         </w:numPr>
         <w:bidi/>
         <w:rPr>
-          <w:lang w:val="en-US"/>
-        </w:rPr>
-      </w:pPr>
-      <w:r>
-        <w:rPr>
+          <w:sz w:val="28"/>
+          <w:szCs w:val="28"/>
+          <w:lang w:val="en-US"/>
+        </w:rPr>
+      </w:pPr>
+      <w:r>
+        <w:rPr>
+          <w:sz w:val="28"/>
+          <w:szCs w:val="28"/>
           <w:rtl/>
           <w:lang w:val="en-US"/>
         </w:rPr>
@@ -318,12 +482,34 @@
       </w:r>
       <w:r>
         <w:rPr>
-          <w:lang w:val="en-US"/>
-        </w:rPr>
-        <w:t xml:space="preserve"> (properties) </w:t>
-      </w:r>
-      <w:r>
-        <w:rPr>
+          <w:sz w:val="28"/>
+          <w:szCs w:val="28"/>
+          <w:lang w:val="en-US"/>
+        </w:rPr>
+        <w:t xml:space="preserve"> (</w:t>
+      </w:r>
+      <w:r>
+        <w:rPr>
+          <w:b/>
+          <w:bCs/>
+          <w:sz w:val="28"/>
+          <w:szCs w:val="28"/>
+          <w:lang w:val="en-US"/>
+        </w:rPr>
+        <w:t>properties</w:t>
+      </w:r>
+      <w:r>
+        <w:rPr>
+          <w:sz w:val="28"/>
+          <w:szCs w:val="28"/>
+          <w:lang w:val="en-US"/>
+        </w:rPr>
+        <w:t xml:space="preserve">) </w:t>
+      </w:r>
+      <w:r>
+        <w:rPr>
+          <w:sz w:val="28"/>
+          <w:szCs w:val="28"/>
           <w:rtl/>
           <w:lang w:val="en-US"/>
         </w:rPr>
@@ -339,11 +525,15 @@
         </w:numPr>
         <w:bidi/>
         <w:rPr>
-          <w:lang w:val="en-US"/>
-        </w:rPr>
-      </w:pPr>
-      <w:r>
-        <w:rPr>
+          <w:sz w:val="28"/>
+          <w:szCs w:val="28"/>
+          <w:lang w:val="en-US"/>
+        </w:rPr>
+      </w:pPr>
+      <w:r>
+        <w:rPr>
+          <w:sz w:val="28"/>
+          <w:szCs w:val="28"/>
           <w:rtl/>
           <w:lang w:val="en-US"/>
         </w:rPr>
@@ -351,9 +541,29 @@
       </w:r>
       <w:r>
         <w:rPr>
-          <w:lang w:val="en-US"/>
-        </w:rPr>
-        <w:t xml:space="preserve"> constructor </w:t>
+          <w:sz w:val="28"/>
+          <w:szCs w:val="28"/>
+          <w:lang w:val="en-US"/>
+        </w:rPr>
+        <w:t xml:space="preserve"> </w:t>
+      </w:r>
+      <w:r>
+        <w:rPr>
+          <w:b/>
+          <w:bCs/>
+          <w:sz w:val="28"/>
+          <w:szCs w:val="28"/>
+          <w:lang w:val="en-US"/>
+        </w:rPr>
+        <w:t>constructor</w:t>
+      </w:r>
+      <w:r>
+        <w:rPr>
+          <w:sz w:val="28"/>
+          <w:szCs w:val="28"/>
+          <w:lang w:val="en-US"/>
+        </w:rPr>
+        <w:t xml:space="preserve"> </w:t>
       </w:r>
     </w:p>
     <w:p>
@@ -365,11 +575,15 @@
         </w:numPr>
         <w:bidi/>
         <w:rPr>
-          <w:lang w:val="en-US"/>
-        </w:rPr>
-      </w:pPr>
-      <w:r>
-        <w:rPr>
+          <w:sz w:val="28"/>
+          <w:szCs w:val="28"/>
+          <w:lang w:val="en-US"/>
+        </w:rPr>
+      </w:pPr>
+      <w:r>
+        <w:rPr>
+          <w:sz w:val="28"/>
+          <w:szCs w:val="28"/>
           <w:rtl/>
           <w:lang w:val="en-US"/>
         </w:rPr>
@@ -377,10 +591,65 @@
       </w:r>
       <w:r>
         <w:rPr>
-          <w:lang w:val="en-US"/>
-        </w:rPr>
-        <w:t xml:space="preserve"> keyword: abstract </w:t>
-      </w:r>
+          <w:sz w:val="28"/>
+          <w:szCs w:val="28"/>
+          <w:lang w:val="en-US"/>
+        </w:rPr>
+        <w:t xml:space="preserve"> </w:t>
+      </w:r>
+      <w:r>
+        <w:rPr>
+          <w:b/>
+          <w:bCs/>
+          <w:sz w:val="28"/>
+          <w:szCs w:val="28"/>
+          <w:lang w:val="en-US"/>
+        </w:rPr>
+        <w:t>keyword: abstract</w:t>
+      </w:r>
+      <w:r>
+        <w:rPr>
+          <w:sz w:val="28"/>
+          <w:szCs w:val="28"/>
+          <w:lang w:val="en-US"/>
+        </w:rPr>
+        <w:t xml:space="preserve"> </w:t>
+      </w:r>
+      <w:r>
+        <w:rPr>
+          <w:rFonts w:hint="cs"/>
+          <w:sz w:val="28"/>
+          <w:szCs w:val="28"/>
+          <w:rtl/>
+          <w:lang w:val="en-US"/>
+        </w:rPr>
+        <w:t xml:space="preserve"> قبل </w:t>
+      </w:r>
+      <w:r>
+        <w:rPr>
+          <w:b/>
+          <w:bCs/>
+          <w:sz w:val="28"/>
+          <w:szCs w:val="28"/>
+          <w:lang w:val="en-US"/>
+        </w:rPr>
+        <w:t>class</w:t>
+      </w:r>
+    </w:p>
+    <w:p>
+      <w:pPr>
+        <w:pStyle w:val="Bibliography"/>
+        <w:numPr>
+          <w:ilvl w:val="0"/>
+          <w:numId w:val="18"/>
+        </w:numPr>
+        <w:bidi/>
+        <w:rPr>
+          <w:sz w:val="28"/>
+          <w:szCs w:val="28"/>
+          <w:lang w:val="en-US"/>
+        </w:rPr>
+      </w:pPr>
     </w:p>
     <w:p>
       <w:pPr>
@@ -393,6 +662,7 @@
           <w:szCs w:val="36"/>
         </w:rPr>
       </w:pPr>
+      <w:proofErr w:type="spellStart"/>
       <w:r>
         <w:rPr>
           <w:rFonts w:ascii="Arial" w:hAnsi="Arial" w:cs="Arial"/>
@@ -403,6 +673,7 @@
         </w:rPr>
         <w:t>مثال</w:t>
       </w:r>
+      <w:proofErr w:type="spellEnd"/>
       <w:r>
         <w:rPr>
           <w:rFonts w:hint="cs"/>
@@ -528,46 +799,6 @@
     </w:p>
     <w:p>
       <w:pPr>
-        <w:pStyle w:val="FirstParagraph"/>
-        <w:bidi/>
-        <w:rPr>
-          <w:rFonts w:asciiTheme="majorHAnsi" w:eastAsiaTheme="majorEastAsia" w:hAnsiTheme="majorHAnsi" w:cstheme="majorBidi"/>
-          <w:color w:val="0F4761" w:themeColor="accent1" w:themeShade="BF"/>
-          <w:sz w:val="32"/>
-          <w:szCs w:val="32"/>
-          <w:rtl/>
-        </w:rPr>
-      </w:pPr>
-    </w:p>
-    <w:p>
-      <w:pPr>
-        <w:pStyle w:val="BodyText"/>
-        <w:bidi/>
-        <w:rPr>
-          <w:rtl/>
-        </w:rPr>
-      </w:pPr>
-    </w:p>
-    <w:p>
-      <w:pPr>
-        <w:pStyle w:val="BodyText"/>
-        <w:bidi/>
-        <w:rPr>
-          <w:rtl/>
-        </w:rPr>
-      </w:pPr>
-    </w:p>
-    <w:p>
-      <w:pPr>
-        <w:pStyle w:val="BodyText"/>
-        <w:bidi/>
-        <w:rPr>
-          <w:rtl/>
-        </w:rPr>
-      </w:pPr>
-    </w:p>
-    <w:p>
-      <w:pPr>
         <w:pStyle w:val="BodyText"/>
         <w:bidi/>
         <w:rPr>
@@ -645,7 +876,21 @@
         <w:rPr>
           <w:lang w:val="en-US"/>
         </w:rPr>
-        <w:t xml:space="preserve"> Interface </w:t>
+        <w:t xml:space="preserve"> </w:t>
+      </w:r>
+      <w:r>
+        <w:rPr>
+          <w:b/>
+          <w:bCs/>
+          <w:lang w:val="en-US"/>
+        </w:rPr>
+        <w:t>Interface</w:t>
+      </w:r>
+      <w:r>
+        <w:rPr>
+          <w:lang w:val="en-US"/>
+        </w:rPr>
+        <w:t xml:space="preserve"> </w:t>
       </w:r>
       <w:r>
         <w:rPr>
@@ -657,7 +902,21 @@
         <w:rPr>
           <w:lang w:val="en-US"/>
         </w:rPr>
-        <w:t xml:space="preserve"> (Contract) </w:t>
+        <w:t xml:space="preserve"> (</w:t>
+      </w:r>
+      <w:r>
+        <w:rPr>
+          <w:b/>
+          <w:bCs/>
+          <w:lang w:val="en-US"/>
+        </w:rPr>
+        <w:t>Contract</w:t>
+      </w:r>
+      <w:r>
+        <w:rPr>
+          <w:lang w:val="en-US"/>
+        </w:rPr>
+        <w:t xml:space="preserve">) </w:t>
       </w:r>
       <w:r>
         <w:rPr>
@@ -669,7 +928,21 @@
         <w:rPr>
           <w:lang w:val="en-US"/>
         </w:rPr>
-        <w:t xml:space="preserve"> (implement) </w:t>
+        <w:t xml:space="preserve"> (</w:t>
+      </w:r>
+      <w:r>
+        <w:rPr>
+          <w:b/>
+          <w:bCs/>
+          <w:lang w:val="en-US"/>
+        </w:rPr>
+        <w:t>implement</w:t>
+      </w:r>
+      <w:r>
+        <w:rPr>
+          <w:lang w:val="en-US"/>
+        </w:rPr>
+        <w:t xml:space="preserve">) </w:t>
       </w:r>
       <w:r>
         <w:rPr>
@@ -762,20 +1035,44 @@
         </w:numPr>
         <w:bidi/>
         <w:rPr>
-          <w:lang w:val="en-US"/>
-        </w:rPr>
-      </w:pPr>
-      <w:r>
-        <w:rPr>
+          <w:sz w:val="28"/>
+          <w:szCs w:val="28"/>
+          <w:lang w:val="en-US"/>
+        </w:rPr>
+      </w:pPr>
+      <w:r>
+        <w:rPr>
+          <w:sz w:val="28"/>
+          <w:szCs w:val="28"/>
           <w:rtl/>
         </w:rPr>
         <w:t>بدون</w:t>
       </w:r>
       <w:r>
         <w:rPr>
-          <w:lang w:val="en-US"/>
-        </w:rPr>
-        <w:t xml:space="preserve"> implementation </w:t>
+          <w:sz w:val="28"/>
+          <w:szCs w:val="28"/>
+          <w:lang w:val="en-US"/>
+        </w:rPr>
+        <w:t xml:space="preserve"> </w:t>
+      </w:r>
+      <w:r>
+        <w:rPr>
+          <w:b/>
+          <w:bCs/>
+          <w:sz w:val="28"/>
+          <w:szCs w:val="28"/>
+          <w:lang w:val="en-US"/>
+        </w:rPr>
+        <w:t>implementation</w:t>
+      </w:r>
+      <w:r>
+        <w:rPr>
+          <w:sz w:val="28"/>
+          <w:szCs w:val="28"/>
+          <w:lang w:val="en-US"/>
+        </w:rPr>
+        <w:t xml:space="preserve"> </w:t>
       </w:r>
     </w:p>
     <w:p>
@@ -787,44 +1084,94 @@
         </w:numPr>
         <w:bidi/>
         <w:rPr>
-          <w:lang w:val="en-US"/>
-        </w:rPr>
-      </w:pPr>
-      <w:r>
-        <w:rPr>
+          <w:sz w:val="28"/>
+          <w:szCs w:val="28"/>
+          <w:lang w:val="en-US"/>
+        </w:rPr>
+      </w:pPr>
+      <w:r>
+        <w:rPr>
+          <w:sz w:val="28"/>
+          <w:szCs w:val="28"/>
           <w:rtl/>
         </w:rPr>
         <w:t>لا يحتوي على</w:t>
       </w:r>
       <w:r>
         <w:rPr>
-          <w:lang w:val="en-US"/>
-        </w:rPr>
-        <w:t xml:space="preserve"> properties (</w:t>
-      </w:r>
-      <w:r>
-        <w:rPr>
+          <w:sz w:val="28"/>
+          <w:szCs w:val="28"/>
+          <w:lang w:val="en-US"/>
+        </w:rPr>
+        <w:t xml:space="preserve"> </w:t>
+      </w:r>
+      <w:r>
+        <w:rPr>
+          <w:b/>
+          <w:bCs/>
+          <w:sz w:val="28"/>
+          <w:szCs w:val="28"/>
+          <w:lang w:val="en-US"/>
+        </w:rPr>
+        <w:t>properties</w:t>
+      </w:r>
+      <w:r>
+        <w:rPr>
+          <w:sz w:val="28"/>
+          <w:szCs w:val="28"/>
+          <w:lang w:val="en-US"/>
+        </w:rPr>
+        <w:t xml:space="preserve"> </w:t>
+      </w:r>
+      <w:r>
+        <w:rPr>
+          <w:sz w:val="28"/>
+          <w:szCs w:val="28"/>
           <w:rtl/>
         </w:rPr>
         <w:t>في</w:t>
       </w:r>
       <w:r>
         <w:rPr>
-          <w:lang w:val="en-US"/>
-        </w:rPr>
-        <w:t xml:space="preserve"> PHP </w:t>
-      </w:r>
-      <w:r>
-        <w:rPr>
+          <w:sz w:val="28"/>
+          <w:szCs w:val="28"/>
+          <w:lang w:val="en-US"/>
+        </w:rPr>
+        <w:t xml:space="preserve"> </w:t>
+      </w:r>
+      <w:r>
+        <w:rPr>
+          <w:b/>
+          <w:bCs/>
+          <w:sz w:val="28"/>
+          <w:szCs w:val="28"/>
+          <w:lang w:val="en-US"/>
+        </w:rPr>
+        <w:t>PHP</w:t>
+      </w:r>
+      <w:r>
+        <w:rPr>
+          <w:sz w:val="28"/>
+          <w:szCs w:val="28"/>
+          <w:lang w:val="en-US"/>
+        </w:rPr>
+        <w:t xml:space="preserve"> </w:t>
+      </w:r>
+      <w:r>
+        <w:rPr>
+          <w:sz w:val="28"/>
+          <w:szCs w:val="28"/>
           <w:rtl/>
         </w:rPr>
         <w:t>التقليدي</w:t>
       </w:r>
       <w:r>
         <w:rPr>
-          <w:lang w:val="en-US"/>
-        </w:rPr>
-        <w:t xml:space="preserve">) </w:t>
+          <w:sz w:val="28"/>
+          <w:szCs w:val="28"/>
+          <w:lang w:val="en-US"/>
+        </w:rPr>
+        <w:t xml:space="preserve"> </w:t>
       </w:r>
     </w:p>
     <w:p>
@@ -836,20 +1183,44 @@
         </w:numPr>
         <w:bidi/>
         <w:rPr>
-          <w:lang w:val="en-US"/>
-        </w:rPr>
-      </w:pPr>
-      <w:r>
-        <w:rPr>
+          <w:sz w:val="28"/>
+          <w:szCs w:val="28"/>
+          <w:lang w:val="en-US"/>
+        </w:rPr>
+      </w:pPr>
+      <w:r>
+        <w:rPr>
+          <w:sz w:val="28"/>
+          <w:szCs w:val="28"/>
           <w:rtl/>
         </w:rPr>
         <w:t>لا يحتوي على</w:t>
       </w:r>
       <w:r>
         <w:rPr>
-          <w:lang w:val="en-US"/>
-        </w:rPr>
-        <w:t xml:space="preserve"> constructor </w:t>
+          <w:sz w:val="28"/>
+          <w:szCs w:val="28"/>
+          <w:lang w:val="en-US"/>
+        </w:rPr>
+        <w:t xml:space="preserve"> </w:t>
+      </w:r>
+      <w:r>
+        <w:rPr>
+          <w:b/>
+          <w:bCs/>
+          <w:sz w:val="28"/>
+          <w:szCs w:val="28"/>
+          <w:lang w:val="en-US"/>
+        </w:rPr>
+        <w:t>constructor</w:t>
+      </w:r>
+      <w:r>
+        <w:rPr>
+          <w:sz w:val="28"/>
+          <w:szCs w:val="28"/>
+          <w:lang w:val="en-US"/>
+        </w:rPr>
+        <w:t xml:space="preserve"> </w:t>
       </w:r>
     </w:p>
     <w:p>
@@ -861,20 +1232,44 @@
         </w:numPr>
         <w:bidi/>
         <w:rPr>
-          <w:lang w:val="en-US"/>
-        </w:rPr>
-      </w:pPr>
-      <w:r>
-        <w:rPr>
+          <w:sz w:val="28"/>
+          <w:szCs w:val="28"/>
+          <w:lang w:val="en-US"/>
+        </w:rPr>
+      </w:pPr>
+      <w:r>
+        <w:rPr>
+          <w:sz w:val="28"/>
+          <w:szCs w:val="28"/>
           <w:rtl/>
         </w:rPr>
         <w:t>يمكن للكلاس أن يطبّق أكثر من</w:t>
       </w:r>
       <w:r>
         <w:rPr>
-          <w:lang w:val="en-US"/>
-        </w:rPr>
-        <w:t xml:space="preserve"> Interface </w:t>
+          <w:sz w:val="28"/>
+          <w:szCs w:val="28"/>
+          <w:lang w:val="en-US"/>
+        </w:rPr>
+        <w:t xml:space="preserve"> </w:t>
+      </w:r>
+      <w:r>
+        <w:rPr>
+          <w:b/>
+          <w:bCs/>
+          <w:sz w:val="28"/>
+          <w:szCs w:val="28"/>
+          <w:lang w:val="en-US"/>
+        </w:rPr>
+        <w:t>Interface</w:t>
+      </w:r>
+      <w:r>
+        <w:rPr>
+          <w:sz w:val="28"/>
+          <w:szCs w:val="28"/>
+          <w:lang w:val="en-US"/>
+        </w:rPr>
+        <w:t xml:space="preserve"> </w:t>
       </w:r>
     </w:p>
     <w:p>
@@ -886,20 +1281,80 @@
         </w:numPr>
         <w:bidi/>
         <w:rPr>
-          <w:lang w:val="en-US"/>
-        </w:rPr>
-      </w:pPr>
-      <w:r>
-        <w:rPr>
+          <w:sz w:val="28"/>
+          <w:szCs w:val="28"/>
+          <w:lang w:val="en-US"/>
+        </w:rPr>
+      </w:pPr>
+      <w:r>
+        <w:rPr>
+          <w:sz w:val="28"/>
+          <w:szCs w:val="28"/>
           <w:rtl/>
         </w:rPr>
         <w:t>يستخدم</w:t>
       </w:r>
       <w:r>
         <w:rPr>
-          <w:lang w:val="en-US"/>
-        </w:rPr>
-        <w:t xml:space="preserve"> keyword: interface </w:t>
+          <w:sz w:val="28"/>
+          <w:szCs w:val="28"/>
+          <w:lang w:val="en-US"/>
+        </w:rPr>
+        <w:t xml:space="preserve"> </w:t>
+      </w:r>
+      <w:r>
+        <w:rPr>
+          <w:b/>
+          <w:bCs/>
+          <w:sz w:val="28"/>
+          <w:szCs w:val="28"/>
+          <w:lang w:val="en-US"/>
+        </w:rPr>
+        <w:t xml:space="preserve">keyword: interface </w:t>
+      </w:r>
+      <w:r>
+        <w:rPr>
+          <w:rFonts w:hint="cs"/>
+          <w:b/>
+          <w:bCs/>
+          <w:sz w:val="28"/>
+          <w:szCs w:val="28"/>
+          <w:rtl/>
+          <w:lang w:val="en-US" w:bidi="ar-EG"/>
+        </w:rPr>
+        <w:t xml:space="preserve"> </w:t>
+      </w:r>
+      <w:r>
+        <w:rPr>
+          <w:rFonts w:hint="cs"/>
+          <w:sz w:val="28"/>
+          <w:szCs w:val="28"/>
+          <w:rtl/>
+          <w:lang w:val="en-US" w:bidi="ar-EG"/>
+        </w:rPr>
+        <w:t>بدلا من</w:t>
+      </w:r>
+      <w:r>
+        <w:rPr>
+          <w:rFonts w:hint="cs"/>
+          <w:b/>
+          <w:bCs/>
+          <w:sz w:val="28"/>
+          <w:szCs w:val="28"/>
+          <w:rtl/>
+          <w:lang w:val="en-US" w:bidi="ar-EG"/>
+        </w:rPr>
+        <w:t xml:space="preserve"> </w:t>
+      </w:r>
+      <w:r>
+        <w:rPr>
+          <w:b/>
+          <w:bCs/>
+          <w:sz w:val="28"/>
+          <w:szCs w:val="28"/>
+          <w:lang w:val="en-US" w:bidi="ar-EG"/>
+        </w:rPr>
+        <w:t>class</w:t>
       </w:r>
     </w:p>
     <w:p>
@@ -919,6 +1374,7 @@
           <w:szCs w:val="36"/>
         </w:rPr>
       </w:pPr>
+      <w:proofErr w:type="spellStart"/>
       <w:r>
         <w:rPr>
           <w:rFonts w:ascii="Arial" w:hAnsi="Arial" w:cs="Arial"/>
@@ -938,6 +1394,7 @@
         </w:rPr>
         <w:t>ثال</w:t>
       </w:r>
+      <w:proofErr w:type="spellEnd"/>
       <w:r>
         <w:rPr>
           <w:rFonts w:hint="cs"/>
@@ -1535,7 +1992,25 @@
           <w:szCs w:val="28"/>
           <w:rtl/>
         </w:rPr>
-        <w:t xml:space="preserve">يكون هناك كود مشترك بين الكلاسات </w:t>
+        <w:t xml:space="preserve">يكون هناك كود مشترك بين </w:t>
+      </w:r>
+      <w:proofErr w:type="spellStart"/>
+      <w:r>
+        <w:rPr>
+          <w:sz w:val="28"/>
+          <w:szCs w:val="28"/>
+          <w:rtl/>
+        </w:rPr>
+        <w:t>الكلاسات</w:t>
+      </w:r>
+      <w:proofErr w:type="spellEnd"/>
+      <w:r>
+        <w:rPr>
+          <w:sz w:val="28"/>
+          <w:szCs w:val="28"/>
+          <w:rtl/>
+        </w:rPr>
+        <w:t xml:space="preserve"> </w:t>
       </w:r>
     </w:p>
     <w:p>
@@ -1694,7 +2169,21 @@
         <w:rPr>
           <w:rtl/>
         </w:rPr>
-        <w:t xml:space="preserve">تريد فرض سلوك معين على عدة كلاسات </w:t>
+        <w:t xml:space="preserve">تريد فرض سلوك معين على عدة </w:t>
+      </w:r>
+      <w:proofErr w:type="spellStart"/>
+      <w:r>
+        <w:rPr>
+          <w:rtl/>
+        </w:rPr>
+        <w:t>كلاسات</w:t>
+      </w:r>
+      <w:proofErr w:type="spellEnd"/>
+      <w:r>
+        <w:rPr>
+          <w:rtl/>
+        </w:rPr>
+        <w:t xml:space="preserve"> </w:t>
       </w:r>
     </w:p>
     <w:p>
@@ -2020,6 +2509,7 @@
           <w:szCs w:val="36"/>
         </w:rPr>
       </w:pPr>
+      <w:proofErr w:type="spellStart"/>
       <w:r>
         <w:rPr>
           <w:rFonts w:ascii="Arial" w:hAnsi="Arial" w:cs="Arial"/>
@@ -2030,6 +2520,7 @@
         </w:rPr>
         <w:t>مثال</w:t>
       </w:r>
+      <w:proofErr w:type="spellEnd"/>
       <w:r>
         <w:rPr>
           <w:rFonts w:hint="cs"/>

</xml_diff>